<commit_message>
Rebuild Word drafts with revision changes (abbreviations first, consolidated refs last)
Co-Authored-By: Claude Opus 4.8 <noreply@anthropic.com>
</commit_message>
<xml_diff>
--- a/report/Report-2-Textiles-Pharma-Petrochem-Sugar-Plastics-Cement.docx
+++ b/report/Report-2-Textiles-Pharma-Petrochem-Sugar-Plastics-Cement.docx
@@ -2522,16 +2522,41 @@
         <w:t>Textiles &amp; Garments, Pharmaceuticals, Petrochemicals &amp; Fertilizers, Sugar &amp; Confectionery, Plastics &amp; Packaging, and Cement &amp; Building Materials</w:t>
       </w:r>
       <w:r>
-        <w:t xml:space="preserve"> — and identifies, for each, the three to four products Uganda should prioritize for competitive manufacturing. It is a </w:t>
-      </w:r>
+        <w:t xml:space="preserve"> — and identifies, for each, the three to four products Uganda should prioritize for competitive manufacturing.</w:t>
+      </w:r>
+    </w:p>
+    <w:p>
       <w:r>
         <w:rPr>
           <w:b/>
         </w:rPr>
-        <w:t>desk-based diagnostic, offered for validation</w:t>
-      </w:r>
-      <w:r>
-        <w:t xml:space="preserve"> through key informant interviews and a stakeholder workshop (Chapter 3). All trade figures are from International Trade Centre (ITC) TradeMap (2024), cited at the point of use.</w:t>
+        <w:t>The governing purpose of this report is the Tenfold Growth Strategy.</w:t>
+      </w:r>
+      <w:r>
+        <w:t xml:space="preserve"> Every finding, market projection and recommendation is assessed against one question: </w:t>
+      </w:r>
+      <w:r>
+        <w:rPr>
+          <w:i/>
+        </w:rPr>
+        <w:t>what does it take for these chains to help grow Uganda's economy roughly tenfold by 2040?</w:t>
+      </w:r>
+      <w:r>
+        <w:t xml:space="preserve"> That lens sets the ambition (the markets Uganda must create and secure ahead of demand), the prioritisation (durable, sustainable advantage over short-lived wins), and the diagnostic, action-oriented tone.</w:t>
+      </w:r>
+    </w:p>
+    <w:p>
+      <w:r>
+        <w:t xml:space="preserve">The study draws </w:t>
+      </w:r>
+      <w:r>
+        <w:rPr>
+          <w:b/>
+        </w:rPr>
+        <w:t>primarily on engagement with MTIC sector experts through the Technical Working Group (TWG)</w:t>
+      </w:r>
+      <w:r>
+        <w:t>, corroborated by official Ugandan data (UBOS first) and International Trade Centre (ITC) TradeMap (2024) figures cited at the point of use; it is offered for validation (Chapter 3).</w:t>
       </w:r>
     </w:p>
     <w:p>
@@ -3249,7 +3274,7 @@
     </w:p>
     <w:p>
       <w:r>
-        <w:t>Report 2's chains divide into three groups, each with a clear move:</w:t>
+        <w:t>The six value chains divide into three groups, each with a clear move:</w:t>
       </w:r>
     </w:p>
     <w:p>
@@ -3579,7 +3604,7 @@
     </w:p>
     <w:p>
       <w:r>
-        <w:t>This study supports PCP Priority Areas 1 and 2, providing technical inputs for the six Report 2 value chains.</w:t>
+        <w:t>This study supports PCP Priority Areas 1 and 2, providing technical inputs for the study's six value chains — Textiles &amp; Garments, Pharmaceuticals, Petrochemicals &amp; Fertilizers, Sugar &amp; Confectionery, Plastics &amp; Packaging, and Cement &amp; Building Materials.</w:t>
       </w:r>
     </w:p>
     <w:p>
@@ -4230,140 +4255,6 @@
       </w:r>
     </w:p>
     <w:p>
-      <w:pPr>
-        <w:pStyle w:val="Heading2"/>
-      </w:pPr>
-      <w:r>
-        <w:t>References</w:t>
-      </w:r>
-    </w:p>
-    <w:p>
-      <w:pPr>
-        <w:pStyle w:val="ListBullet"/>
-      </w:pPr>
-      <w:r>
-        <w:t xml:space="preserve">National Planning Authority, </w:t>
-      </w:r>
-      <w:r>
-        <w:rPr>
-          <w:i/>
-        </w:rPr>
-        <w:t>Uganda Vision 2040</w:t>
-      </w:r>
-      <w:r>
-        <w:t xml:space="preserve">; </w:t>
-      </w:r>
-      <w:r>
-        <w:rPr>
-          <w:i/>
-        </w:rPr>
-        <w:t>NDP IV (FY2025/26–2029/30)</w:t>
-      </w:r>
-      <w:r>
-        <w:t>. https://npa.go.ug/national-development-plan/</w:t>
-      </w:r>
-    </w:p>
-    <w:p>
-      <w:pPr>
-        <w:pStyle w:val="ListBullet"/>
-      </w:pPr>
-      <w:r>
-        <w:t>Parliament of Uganda, NDP IV launch. https://www.parliament.go.ug/news/3724/president-launches-ndp-iv-drive-ugandas-economic-transformation</w:t>
-      </w:r>
-    </w:p>
-    <w:p>
-      <w:pPr>
-        <w:pStyle w:val="ListBullet"/>
-      </w:pPr>
-      <w:r>
-        <w:t xml:space="preserve">MTIC, </w:t>
-      </w:r>
-      <w:r>
-        <w:rPr>
-          <w:i/>
-        </w:rPr>
-        <w:t>National Industrial Policy 2020</w:t>
-      </w:r>
-      <w:r>
-        <w:t>. https://www.mtic.go.ug/</w:t>
-      </w:r>
-    </w:p>
-    <w:p>
-      <w:pPr>
-        <w:pStyle w:val="ListBullet"/>
-      </w:pPr>
-      <w:r>
-        <w:t xml:space="preserve">UNIDO, </w:t>
-      </w:r>
-      <w:r>
-        <w:rPr>
-          <w:i/>
-        </w:rPr>
-        <w:t>Programme for Country Partnership</w:t>
-      </w:r>
-      <w:r>
-        <w:t>. https://www.unido.org/programme-country-partnership</w:t>
-      </w:r>
-    </w:p>
-    <w:p>
-      <w:pPr>
-        <w:pStyle w:val="ListBullet"/>
-      </w:pPr>
-      <w:r>
-        <w:t xml:space="preserve">World Bank, </w:t>
-      </w:r>
-      <w:r>
-        <w:rPr>
-          <w:i/>
-        </w:rPr>
-        <w:t>World Development Indicators</w:t>
-      </w:r>
-      <w:r>
-        <w:t>. https://data.worldbank.org/indicator/NV.IND.MANF.ZS?locations=UG</w:t>
-      </w:r>
-    </w:p>
-    <w:p>
-      <w:pPr>
-        <w:pStyle w:val="ListBullet"/>
-      </w:pPr>
-      <w:r>
-        <w:t>Cotton Development Organisation. https://www.cdouga.org/</w:t>
-      </w:r>
-    </w:p>
-    <w:p>
-      <w:pPr>
-        <w:pStyle w:val="ListBullet"/>
-      </w:pPr>
-      <w:r>
-        <w:t xml:space="preserve">UNIDO, </w:t>
-      </w:r>
-      <w:r>
-        <w:rPr>
-          <w:i/>
-        </w:rPr>
-        <w:t>Pharmaceutical Sector Profile — Uganda</w:t>
-      </w:r>
-      <w:r>
-        <w:t>. https://open.unido.org/</w:t>
-      </w:r>
-    </w:p>
-    <w:p>
-      <w:pPr>
-        <w:pStyle w:val="ListBullet"/>
-      </w:pPr>
-      <w:r>
-        <w:t>Uganda Investment Authority (2025). https://ugandainvest.go.ug/</w:t>
-      </w:r>
-    </w:p>
-    <w:p>
-      <w:pPr>
-        <w:pStyle w:val="ListBullet"/>
-      </w:pPr>
-      <w:r>
-        <w:t>ITC TradeMap. https://www.trademap.org</w:t>
-      </w:r>
-    </w:p>
-    <w:p>
       <w:r>
         <w:br w:type="page"/>
       </w:r>
@@ -4419,21 +4310,57 @@
     </w:p>
     <w:p>
       <w:r>
-        <w:t xml:space="preserve">This is a </w:t>
+        <w:t xml:space="preserve">This diagnostic was produced through </w:t>
       </w:r>
       <w:r>
         <w:rPr>
           <w:b/>
         </w:rPr>
-        <w:t>desk-based diagnostic</w:t>
-      </w:r>
-      <w:r>
-        <w:t>. Its findings are built from a structured review of government and sector documents provided by MTIC, official Ugandan data sources, live international trade data, and current published evidence — not from primary fieldwork. This is stated plainly because the credibility of a diagnostic that will inform national investment decisions depends on an honest account of how it was produced.</w:t>
+        <w:t>constant engagement with sector experts from the Ministry of Trade, Industry and Cooperatives (MTIC) via the Technical Working Group (TWG)</w:t>
+      </w:r>
+      <w:r>
+        <w:t xml:space="preserve">, complemented by a structured review of government and sector documents, official Ugandan statistics, live international trade data, and current published evidence. </w:t>
+      </w:r>
+      <w:r>
+        <w:rPr>
+          <w:b/>
+        </w:rPr>
+        <w:t>Most of the primary information used in this study was secured through these TWG engagements</w:t>
+      </w:r>
+      <w:r>
+        <w:t xml:space="preserve"> — the sector experts who work with these industries daily are the single richest source of current, firm-level knowledge. Documentary and statistical sources corroborate, quantify, and extend what the engagements established. This is stated plainly because the credibility of a diagnostic that will inform national investment decisions depends on an honest account of how it was produced.</w:t>
       </w:r>
     </w:p>
     <w:p>
       <w:r>
-        <w:t>The study was preceded by an Inception Report documenting the study design, diagnostic framework, data plan, and stakeholder-consultation plan, submitted to the Technical Working Group (TWG) prior to the diagnostic phase. The work proceeded in three phases: (1) evidence assembly; (2) value-chain analysis and prioritization scoring; and (3) validation (planned, post-submission).</w:t>
+        <w:t xml:space="preserve">The study was preceded by an Inception Report documenting the study design, diagnostic framework, data plan, and stakeholder-consultation plan, submitted to the TWG prior to the diagnostic phase. The work proceeded in three phases: (1) </w:t>
+      </w:r>
+      <w:r>
+        <w:rPr>
+          <w:b/>
+        </w:rPr>
+        <w:t>primary engagement</w:t>
+      </w:r>
+      <w:r>
+        <w:t xml:space="preserve"> — continuous consultation with MTIC sector experts through the TWG; (2) </w:t>
+      </w:r>
+      <w:r>
+        <w:rPr>
+          <w:b/>
+        </w:rPr>
+        <w:t>evidence assembly and analysis</w:t>
+      </w:r>
+      <w:r>
+        <w:t xml:space="preserve"> — corroborating and quantifying the engagement findings against documents, official statistics, and trade data, then applying the analytical framework and scoring; and (3) </w:t>
+      </w:r>
+      <w:r>
+        <w:rPr>
+          <w:b/>
+        </w:rPr>
+        <w:t>validation and refinement</w:t>
+      </w:r>
+      <w:r>
+        <w:t xml:space="preserve"> — continued TWG review and a stakeholder workshop.</w:t>
       </w:r>
     </w:p>
     <w:p>
@@ -4444,7 +4371,7 @@
         <w:t>The findings in this report are presented for validation.</w:t>
       </w:r>
       <w:r>
-        <w:t xml:space="preserve"> Where the report states a finding, it reflects the best available desk evidence at the time of writing and is subject to the validation step in Section 3.7.</w:t>
+        <w:t xml:space="preserve"> Where the report states a finding, it reflects the combined weight of TWG engagement and the best available documentary evidence at the time of writing, and is subject to the continued validation in Section 3.7.</w:t>
       </w:r>
     </w:p>
     <w:p>
@@ -4460,6 +4387,17 @@
         <w:rPr>
           <w:b/>
         </w:rPr>
+        <w:t>Primary — TWG sector-expert engagements</w:t>
+      </w:r>
+      <w:r>
+        <w:t xml:space="preserve"> — continuous consultation with MTIC sector experts through the Technical Working Group provided the primary, current, firm-level intelligence on each chain. The sources below corroborate and quantify it. Where UBOS data exists for an indicator, it is used before any secondary or international source.</w:t>
+      </w:r>
+    </w:p>
+    <w:p>
+      <w:r>
+        <w:rPr>
+          <w:b/>
+        </w:rPr>
         <w:t>Government policy and planning</w:t>
       </w:r>
       <w:r>
@@ -4588,7 +4526,25 @@
         <w:t>d. Market Assessment</w:t>
       </w:r>
       <w:r>
-        <w:t xml:space="preserve"> — domestic, regional (EAC/COMESA), and global levels.</w:t>
+        <w:t xml:space="preserve"> — </w:t>
+      </w:r>
+      <w:r>
+        <w:rPr>
+          <w:b/>
+        </w:rPr>
+        <w:t>four levels</w:t>
+      </w:r>
+      <w:r>
+        <w:t xml:space="preserve"> (domestic; regional EAC/COMESA; continental/Africa; global), each with a </w:t>
+      </w:r>
+      <w:r>
+        <w:rPr>
+          <w:b/>
+        </w:rPr>
+        <w:t>2040 projection</w:t>
+      </w:r>
+      <w:r>
+        <w:t>: Uganda's market on the Tenfold Growth Strategy logic (reasoned per chain, not a simple ×10), other markets on business-as-usual growth.</w:t>
       </w:r>
     </w:p>
     <w:p>
@@ -5306,12 +5262,21 @@
         <w:pStyle w:val="Heading2"/>
       </w:pPr>
       <w:r>
-        <w:t>3.7 Validation (Planned)</w:t>
+        <w:t>3.7 Engagement and Validation</w:t>
       </w:r>
     </w:p>
     <w:p>
       <w:r>
-        <w:t xml:space="preserve">Validation follows submission. </w:t>
+        <w:t xml:space="preserve">Engagement with MTIC sector experts through the TWG was </w:t>
+      </w:r>
+      <w:r>
+        <w:rPr>
+          <w:b/>
+        </w:rPr>
+        <w:t>continuous throughout the study</w:t>
+      </w:r>
+      <w:r>
+        <w:t xml:space="preserve"> and is the primary basis of its firm-level findings. Validation now extends that engagement. </w:t>
       </w:r>
       <w:r>
         <w:rPr>
@@ -5320,7 +5285,7 @@
         <w:t>Key informant interviews</w:t>
       </w:r>
       <w:r>
-        <w:t xml:space="preserve"> are planned with public-sector institutions (MTIC, UIA, URA, UBOS, UNBS, NDA, CDO, USMA/Uganda Sugar Board, NEMA, Ministry of Energy/PAU/UNOC), private-sector manufacturers across the six chains, industry associations (UMA, Uganda Pharmaceutical Manufacturers Association), financial institutions, and research institutions. A </w:t>
+        <w:t xml:space="preserve"> continue with public-sector institutions (MTIC, UIA, URA, UBOS, UNBS, NDA, CDO, USMA/Uganda Sugar Board, NEMA, Ministry of Energy/PAU/UNOC), private-sector manufacturers across the six chains, industry associations (UMA, Uganda Pharmaceutical Manufacturers Association), financial institutions, and research institutions. A </w:t>
       </w:r>
       <w:r>
         <w:rPr>
@@ -5348,10 +5313,10 @@
         <w:rPr>
           <w:b/>
         </w:rPr>
-        <w:t>Desk-based scope</w:t>
-      </w:r>
-      <w:r>
-        <w:t xml:space="preserve"> — findings rest on documentary and statistical evidence; the planned KIIs and workshop are how firm-level realities will be tested.</w:t>
+        <w:t>Firm-level data completeness</w:t>
+      </w:r>
+      <w:r>
+        <w:t xml:space="preserve"> — while TWG engagement provides strong current sector intelligence, comprehensive audited firm-level data are not uniformly available; the continued KIIs and workshop test them further.</w:t>
       </w:r>
     </w:p>
     <w:p>
@@ -5413,133 +5378,6 @@
     <w:p>
       <w:r>
         <w:t>These limitations define where validation and monitoring will most strengthen the evidence base; they do not alter the direction of the conclusions.</w:t>
-      </w:r>
-    </w:p>
-    <w:p>
-      <w:pPr>
-        <w:pStyle w:val="Heading2"/>
-      </w:pPr>
-      <w:r>
-        <w:t>References</w:t>
-      </w:r>
-    </w:p>
-    <w:p>
-      <w:pPr>
-        <w:pStyle w:val="ListBullet"/>
-      </w:pPr>
-      <w:r>
-        <w:t xml:space="preserve">National Planning Authority, </w:t>
-      </w:r>
-      <w:r>
-        <w:rPr>
-          <w:i/>
-        </w:rPr>
-        <w:t>Vision 2040</w:t>
-      </w:r>
-      <w:r>
-        <w:t xml:space="preserve">; </w:t>
-      </w:r>
-      <w:r>
-        <w:rPr>
-          <w:i/>
-        </w:rPr>
-        <w:t>NDP IV</w:t>
-      </w:r>
-      <w:r>
-        <w:t>. https://npa.go.ug/national-development-plan/</w:t>
-      </w:r>
-    </w:p>
-    <w:p>
-      <w:pPr>
-        <w:pStyle w:val="ListBullet"/>
-      </w:pPr>
-      <w:r>
-        <w:t xml:space="preserve">MTIC, </w:t>
-      </w:r>
-      <w:r>
-        <w:rPr>
-          <w:i/>
-        </w:rPr>
-        <w:t>National Industrial Policy 2020</w:t>
-      </w:r>
-      <w:r>
-        <w:t>. https://www.mtic.go.ug/</w:t>
-      </w:r>
-    </w:p>
-    <w:p>
-      <w:pPr>
-        <w:pStyle w:val="ListBullet"/>
-      </w:pPr>
-      <w:r>
-        <w:t xml:space="preserve">National Drug Authority, </w:t>
-      </w:r>
-      <w:r>
-        <w:rPr>
-          <w:i/>
-        </w:rPr>
-        <w:t>National Drug Register</w:t>
-      </w:r>
-      <w:r>
-        <w:t xml:space="preserve"> (June 2024). https://www.nda.or.ug/</w:t>
-      </w:r>
-    </w:p>
-    <w:p>
-      <w:pPr>
-        <w:pStyle w:val="ListBullet"/>
-      </w:pPr>
-      <w:r>
-        <w:t xml:space="preserve">NEMA, </w:t>
-      </w:r>
-      <w:r>
-        <w:rPr>
-          <w:i/>
-        </w:rPr>
-        <w:t>National Strategy for Plastics Circularity 2023–2028</w:t>
-      </w:r>
-      <w:r>
-        <w:t xml:space="preserve">; </w:t>
-      </w:r>
-      <w:r>
-        <w:rPr>
-          <w:i/>
-        </w:rPr>
-        <w:t>Effluent Discharge Regulations 2020</w:t>
-      </w:r>
-      <w:r>
-        <w:t>. https://www.nema.go.ug/</w:t>
-      </w:r>
-    </w:p>
-    <w:p>
-      <w:pPr>
-        <w:pStyle w:val="ListBullet"/>
-      </w:pPr>
-      <w:r>
-        <w:t>Electricity Regulatory Authority, tariffs 2025. https://www.era.go.ug/</w:t>
-      </w:r>
-    </w:p>
-    <w:p>
-      <w:pPr>
-        <w:pStyle w:val="ListBullet"/>
-      </w:pPr>
-      <w:r>
-        <w:t xml:space="preserve">World Bank, </w:t>
-      </w:r>
-      <w:r>
-        <w:rPr>
-          <w:i/>
-        </w:rPr>
-        <w:t>World Development Indicators</w:t>
-      </w:r>
-      <w:r>
-        <w:t>. https://data.worldbank.org/country/UG</w:t>
-      </w:r>
-    </w:p>
-    <w:p>
-      <w:pPr>
-        <w:pStyle w:val="ListBullet"/>
-      </w:pPr>
-      <w:r>
-        <w:t>ITC TradeMap. https://www.trademap.org</w:t>
       </w:r>
     </w:p>
     <w:p>
@@ -7800,80 +7638,6 @@
     </w:tbl>
     <w:p/>
     <w:p>
-      <w:pPr>
-        <w:pStyle w:val="Heading2"/>
-      </w:pPr>
-      <w:r>
-        <w:t>References</w:t>
-      </w:r>
-    </w:p>
-    <w:p>
-      <w:pPr>
-        <w:pStyle w:val="ListBullet"/>
-      </w:pPr>
-      <w:r>
-        <w:t>Cotton Development Organisation. https://www.cdouga.org/ ; World Business Journal, "CDO Leads Way for Increased Cotton Subsector Growth." https://worldbusinessjournal.com/cdo-leads-way/</w:t>
-      </w:r>
-    </w:p>
-    <w:p>
-      <w:pPr>
-        <w:pStyle w:val="ListBullet"/>
-      </w:pPr>
-      <w:r>
-        <w:t xml:space="preserve">Economic Policy Research Centre, </w:t>
-      </w:r>
-      <w:r>
-        <w:rPr>
-          <w:i/>
-        </w:rPr>
-        <w:t>Upgrading the cotton value chain for textile industry development</w:t>
-      </w:r>
-      <w:r>
-        <w:t>. https://eprcug.org/publication/upgrading-the-cotton-value-chain-for-textile-industry-development/</w:t>
-      </w:r>
-    </w:p>
-    <w:p>
-      <w:pPr>
-        <w:pStyle w:val="ListBullet"/>
-      </w:pPr>
-      <w:r>
-        <w:t>ChimpReports, "Inside Fine Spinners: spinning Uganda's cotton to European garment stores." https://chimpreports.com/inside-fine-spinners-spinning-ugandas-cotton-to-european-garment-stores/</w:t>
-      </w:r>
-    </w:p>
-    <w:p>
-      <w:pPr>
-        <w:pStyle w:val="ListBullet"/>
-      </w:pPr>
-      <w:r>
-        <w:t>Uganda Investment Authority, "UIA, CDO team up to boost import substitution in cotton sector." https://www.ugandainvest.go.ug/uia-cdo-team-up-to-boost-import-substitution-in-cotton-sector/</w:t>
-      </w:r>
-    </w:p>
-    <w:p>
-      <w:pPr>
-        <w:pStyle w:val="ListBullet"/>
-      </w:pPr>
-      <w:r>
-        <w:t>ITC TradeMap, trade statistics — HS 5201, 6109, Uganda, 2024. https://www.trademap.org</w:t>
-      </w:r>
-    </w:p>
-    <w:p>
-      <w:pPr>
-        <w:pStyle w:val="ListBullet"/>
-      </w:pPr>
-      <w:r>
-        <w:t xml:space="preserve">NEMA, </w:t>
-      </w:r>
-      <w:r>
-        <w:rPr>
-          <w:i/>
-        </w:rPr>
-        <w:t>Effluent Discharge Regulations 2020</w:t>
-      </w:r>
-      <w:r>
-        <w:t>. https://www.nema.go.ug/</w:t>
-      </w:r>
-    </w:p>
-    <w:p>
       <w:r>
         <w:br w:type="page"/>
       </w:r>
@@ -10084,81 +9848,6 @@
     </w:tbl>
     <w:p/>
     <w:p>
-      <w:pPr>
-        <w:pStyle w:val="Heading2"/>
-      </w:pPr>
-      <w:r>
-        <w:t>References</w:t>
-      </w:r>
-    </w:p>
-    <w:p>
-      <w:pPr>
-        <w:pStyle w:val="ListBullet"/>
-      </w:pPr>
-      <w:r>
-        <w:t xml:space="preserve">National Drug Authority, </w:t>
-      </w:r>
-      <w:r>
-        <w:rPr>
-          <w:i/>
-        </w:rPr>
-        <w:t>National Drug Register of Uganda — Human Medicines</w:t>
-      </w:r>
-      <w:r>
-        <w:t xml:space="preserve"> (June 2024). https://www.nda.or.ug/</w:t>
-      </w:r>
-    </w:p>
-    <w:p>
-      <w:pPr>
-        <w:pStyle w:val="ListBullet"/>
-      </w:pPr>
-      <w:r>
-        <w:t xml:space="preserve">UNIDO, </w:t>
-      </w:r>
-      <w:r>
-        <w:rPr>
-          <w:i/>
-        </w:rPr>
-        <w:t>Pharmaceutical Sector Profile — Uganda</w:t>
-      </w:r>
-      <w:r>
-        <w:t>. https://open.unido.org/api/documents/4699932/download/Pharmaceutical%20Sector%20Profile%20-%20Uganda</w:t>
-      </w:r>
-    </w:p>
-    <w:p>
-      <w:pPr>
-        <w:pStyle w:val="ListBullet"/>
-      </w:pPr>
-      <w:r>
-        <w:t xml:space="preserve">Statista, </w:t>
-      </w:r>
-      <w:r>
-        <w:rPr>
-          <w:i/>
-        </w:rPr>
-        <w:t>Pharmaceuticals — Uganda</w:t>
-      </w:r>
-      <w:r>
-        <w:t>. https://www.statista.com/outlook/hmo/pharmaceuticals/uganda</w:t>
-      </w:r>
-    </w:p>
-    <w:p>
-      <w:pPr>
-        <w:pStyle w:val="ListBullet"/>
-      </w:pPr>
-      <w:r>
-        <w:t>Quality Chemical Industries Limited (Wikipedia summary); Cipla Uganda. https://en.wikipedia.org/wiki/Quality_Chemical_Industries_Limited ; https://www.cipla.com/our-presence/uganda</w:t>
-      </w:r>
-    </w:p>
-    <w:p>
-      <w:pPr>
-        <w:pStyle w:val="ListBullet"/>
-      </w:pPr>
-      <w:r>
-        <w:t>ITC TradeMap, trade statistics — HS 3004, Uganda, 2024. https://www.trademap.org</w:t>
-      </w:r>
-    </w:p>
-    <w:p>
       <w:r>
         <w:br w:type="page"/>
       </w:r>
@@ -12358,70 +12047,6 @@
     </w:tbl>
     <w:p/>
     <w:p>
-      <w:pPr>
-        <w:pStyle w:val="Heading2"/>
-      </w:pPr>
-      <w:r>
-        <w:t>References</w:t>
-      </w:r>
-    </w:p>
-    <w:p>
-      <w:pPr>
-        <w:pStyle w:val="ListBullet"/>
-      </w:pPr>
-      <w:r>
-        <w:t>Uganda National Oil Company, "The Uganda Refinery Project." https://www.unoc.co.ug/midstream/the-uganda-refinery-project/</w:t>
-      </w:r>
-    </w:p>
-    <w:p>
-      <w:pPr>
-        <w:pStyle w:val="ListBullet"/>
-      </w:pPr>
-      <w:r>
-        <w:t>Petroleum Authority of Uganda, "The Uganda Refinery Project." https://www.pau.go.ug/the-uganda-refinery-project/</w:t>
-      </w:r>
-    </w:p>
-    <w:p>
-      <w:pPr>
-        <w:pStyle w:val="ListBullet"/>
-      </w:pPr>
-      <w:r>
-        <w:t>Hydrocarbon Engineering, "Uganda refinery to start operations by early 2030" (Oct 2025). https://www.hydrocarbonengineering.com/refining/13102025/uganda-refinery-to-start-operations-by-early-2030/</w:t>
-      </w:r>
-    </w:p>
-    <w:p>
-      <w:pPr>
-        <w:pStyle w:val="ListBullet"/>
-      </w:pPr>
-      <w:r>
-        <w:t>Osukuru Industrial Complex (Wikipedia). https://en.wikipedia.org/wiki/Osukuru_Industrial_Complex</w:t>
-      </w:r>
-    </w:p>
-    <w:p>
-      <w:pPr>
-        <w:pStyle w:val="ListBullet"/>
-      </w:pPr>
-      <w:r>
-        <w:t>Free Zones Authority, "President commissions Tororo Sukulu Phosphate Project." https://freezones.go.ug/president-commissions-tororo-sukulu-phosphate-project/</w:t>
-      </w:r>
-    </w:p>
-    <w:p>
-      <w:pPr>
-        <w:pStyle w:val="ListBullet"/>
-      </w:pPr>
-      <w:r>
-        <w:t>Milling Middle East &amp; Africa, "Tororo Fertiliser Factory in limbo five months after resuming operations" (2023). https://www.millingmea.com/tororo-fertiliser-factory-in-limbo-five-months-after-resuming-operations/</w:t>
-      </w:r>
-    </w:p>
-    <w:p>
-      <w:pPr>
-        <w:pStyle w:val="ListBullet"/>
-      </w:pPr>
-      <w:r>
-        <w:t>ITC TradeMap, trade statistics — HS 3105, Uganda, 2024. https://www.trademap.org</w:t>
-      </w:r>
-    </w:p>
-    <w:p>
       <w:r>
         <w:br w:type="page"/>
       </w:r>
@@ -14666,78 +14291,6 @@
     </w:tbl>
     <w:p/>
     <w:p>
-      <w:pPr>
-        <w:pStyle w:val="Heading2"/>
-      </w:pPr>
-      <w:r>
-        <w:t>References</w:t>
-      </w:r>
-    </w:p>
-    <w:p>
-      <w:pPr>
-        <w:pStyle w:val="ListBullet"/>
-      </w:pPr>
-      <w:r>
-        <w:rPr>
-          <w:i/>
-        </w:rPr>
-        <w:t>Sugar industry in Uganda</w:t>
-      </w:r>
-      <w:r>
-        <w:t xml:space="preserve"> (Wikipedia, with USMA and Uganda Sugar Board data). https://en.wikipedia.org/wiki/Sugar_industry_in_Uganda</w:t>
-      </w:r>
-    </w:p>
-    <w:p>
-      <w:pPr>
-        <w:pStyle w:val="ListBullet"/>
-      </w:pPr>
-      <w:r>
-        <w:t>Daily Monitor, "Surge in sugar factories imperils industry's future." https://www.monitor.co.ug/uganda/news/national/surge-in-sugar-factories-imperils-industry-s-future-3943728</w:t>
-      </w:r>
-    </w:p>
-    <w:p>
-      <w:pPr>
-        <w:pStyle w:val="ListBullet"/>
-      </w:pPr>
-      <w:r>
-        <w:t>Food Business MEA, "Kinyara Sugar opens US$15m industrial sugar refinery" (2023). https://www.foodbusinessmea.com/ugandas-second-largest-sugar-miller-kinyara-sugar-has-opened-us15m-industrial-sugar-refinery/</w:t>
-      </w:r>
-    </w:p>
-    <w:p>
-      <w:pPr>
-        <w:pStyle w:val="ListBullet"/>
-      </w:pPr>
-      <w:r>
-        <w:t>Kakira Sugar. https://kakirasugar.com/</w:t>
-      </w:r>
-    </w:p>
-    <w:p>
-      <w:pPr>
-        <w:pStyle w:val="ListBullet"/>
-      </w:pPr>
-      <w:r>
-        <w:t xml:space="preserve">Uganda Sugar Manufacturers' Association annual report 2024 [Repository: </w:t>
-      </w:r>
-      <w:r>
-        <w:rPr>
-          <w:rFonts w:ascii="Consolas" w:hAnsi="Consolas"/>
-          <w:sz w:val="19"/>
-        </w:rPr>
-        <w:t>data/</w:t>
-      </w:r>
-      <w:r>
-        <w:t xml:space="preserve"> — provided by MTIC].</w:t>
-      </w:r>
-    </w:p>
-    <w:p>
-      <w:pPr>
-        <w:pStyle w:val="ListBullet"/>
-      </w:pPr>
-      <w:r>
-        <w:t>ITC TradeMap, trade statistics — HS 1701, Uganda, 2024. https://www.trademap.org</w:t>
-      </w:r>
-    </w:p>
-    <w:p>
       <w:r>
         <w:br w:type="page"/>
       </w:r>
@@ -16993,80 +16546,6 @@
     </w:tbl>
     <w:p/>
     <w:p>
-      <w:pPr>
-        <w:pStyle w:val="Heading2"/>
-      </w:pPr>
-      <w:r>
-        <w:t>References</w:t>
-      </w:r>
-    </w:p>
-    <w:p>
-      <w:pPr>
-        <w:pStyle w:val="ListBullet"/>
-      </w:pPr>
-      <w:r>
-        <w:t xml:space="preserve">NEMA, </w:t>
-      </w:r>
-      <w:r>
-        <w:rPr>
-          <w:i/>
-        </w:rPr>
-        <w:t>National Strategy for Management of Plastic Pollution / Plastics Circularity (2023–2028)</w:t>
-      </w:r>
-      <w:r>
-        <w:t>. https://www.nema.go.ug/new_site/wp-content/uploads/2024/05/Plastic_circularity_-Report-2023-1.pdf</w:t>
-      </w:r>
-    </w:p>
-    <w:p>
-      <w:pPr>
-        <w:pStyle w:val="ListBullet"/>
-      </w:pPr>
-      <w:r>
-        <w:t>NEMA, "Plastics." https://www.nema.go.ug/en/plastics/</w:t>
-      </w:r>
-    </w:p>
-    <w:p>
-      <w:pPr>
-        <w:pStyle w:val="ListBullet"/>
-      </w:pPr>
-      <w:r>
-        <w:t>Margherita News, "NEMA pushes for total ban of polythene bags in Uganda" (Mar 2025). https://margheritanews.ug/2025/03/nema-pushes-for-total-polythene-bags-of-kevera-in-uganda/</w:t>
-      </w:r>
-    </w:p>
-    <w:p>
-      <w:pPr>
-        <w:pStyle w:val="ListBullet"/>
-      </w:pPr>
-      <w:r>
-        <w:t xml:space="preserve">Reportlinker, </w:t>
-      </w:r>
-      <w:r>
-        <w:rPr>
-          <w:i/>
-        </w:rPr>
-        <w:t>Uganda Plastic Industry Outlook 2024–2028</w:t>
-      </w:r>
-      <w:r>
-        <w:t>. https://www.reportlinker.com/clp/country/6347/726256</w:t>
-      </w:r>
-    </w:p>
-    <w:p>
-      <w:pPr>
-        <w:pStyle w:val="ListBullet"/>
-      </w:pPr>
-      <w:r>
-        <w:t>Nile Plastic Industries. https://www.nileplasticindustries.com/</w:t>
-      </w:r>
-    </w:p>
-    <w:p>
-      <w:pPr>
-        <w:pStyle w:val="ListBullet"/>
-      </w:pPr>
-      <w:r>
-        <w:t>ITC TradeMap, trade statistics — HS 3923, Uganda, 2024. https://www.trademap.org</w:t>
-      </w:r>
-    </w:p>
-    <w:p>
       <w:r>
         <w:br w:type="page"/>
       </w:r>
@@ -19259,85 +18738,6 @@
     </w:tbl>
     <w:p/>
     <w:p>
-      <w:pPr>
-        <w:pStyle w:val="Heading2"/>
-      </w:pPr>
-      <w:r>
-        <w:t>References</w:t>
-      </w:r>
-    </w:p>
-    <w:p>
-      <w:pPr>
-        <w:pStyle w:val="ListBullet"/>
-      </w:pPr>
-      <w:r>
-        <w:t xml:space="preserve">IndexBox, </w:t>
-      </w:r>
-      <w:r>
-        <w:rPr>
-          <w:i/>
-        </w:rPr>
-        <w:t>Uganda's Cement Market Report 2025</w:t>
-      </w:r>
-      <w:r>
-        <w:t>. https://www.indexbox.io/store/uganda-cement-market-analysis-forecast-size-trends-and-insights/</w:t>
-      </w:r>
-    </w:p>
-    <w:p>
-      <w:pPr>
-        <w:pStyle w:val="ListBullet"/>
-      </w:pPr>
-      <w:r>
-        <w:t>CemNet / International Cement Review, Uganda country data. https://www.cemnet.com/global-cement-report/country/uganda</w:t>
-      </w:r>
-    </w:p>
-    <w:p>
-      <w:pPr>
-        <w:pStyle w:val="ListBullet"/>
-      </w:pPr>
-      <w:r>
-        <w:t>Ecofin Agency, "Uganda to Commission $300 Million Cement Plant to Cut Imports Amid Rising Demand." https://www.ecofinagency.com/news-industry/2104-54866-uganda-to-commission-300-million-cement-plant-to-cut-imports-amid-rising-demand</w:t>
-      </w:r>
-    </w:p>
-    <w:p>
-      <w:pPr>
-        <w:pStyle w:val="ListBullet"/>
-      </w:pPr>
-      <w:r>
-        <w:t>CemNet, "Uganda launching US$300m cement plant to boost industry." https://www.cemnet.com/News/story/181356/uganda-launching-us-300m-cement-plant-to-boost-industry.html</w:t>
-      </w:r>
-    </w:p>
-    <w:p>
-      <w:pPr>
-        <w:pStyle w:val="ListBullet"/>
-      </w:pPr>
-      <w:r>
-        <w:rPr>
-          <w:i/>
-        </w:rPr>
-        <w:t>List of cement manufacturers in Uganda</w:t>
-      </w:r>
-      <w:r>
-        <w:t xml:space="preserve"> (Wikipedia). https://en.wikipedia.org/wiki/List_of_cement_manufacturers_in_Uganda</w:t>
-      </w:r>
-    </w:p>
-    <w:p>
-      <w:pPr>
-        <w:pStyle w:val="ListBullet"/>
-      </w:pPr>
-      <w:r>
-        <w:t>Hima Cement, "About Us." https://himacement.co/About-Us</w:t>
-      </w:r>
-    </w:p>
-    <w:p>
-      <w:pPr>
-        <w:pStyle w:val="ListBullet"/>
-      </w:pPr>
-      <w:r>
-        <w:t>ITC TradeMap, trade statistics — HS 2523, Uganda, 2024. https://www.trademap.org</w:t>
-      </w:r>
-    </w:p>
-    <w:p>
       <w:r>
         <w:br w:type="page"/>
       </w:r>
@@ -19382,7 +18782,7 @@
     </w:p>
     <w:p>
       <w:r>
-        <w:t xml:space="preserve">The six Report 2 value chains span agro-processing (textiles, sugar), health (pharmaceuticals), agricultural inputs and energy (fertilizers, petrochemicals), and construction-linked manufacturing (cement, plastics). Despite their diversity, they share a common set of binding constraints and a common strategic pattern: </w:t>
+        <w:t xml:space="preserve">The six value chains — Textiles &amp; Garments, Pharmaceuticals, Petrochemicals &amp; Fertilizers, Sugar &amp; Confectionery, Plastics &amp; Packaging, and Cement &amp; Building Materials — span agro-processing (textiles, sugar), health (pharmaceuticals), agricultural inputs and energy (fertilizers, petrochemicals), and construction-linked manufacturing (cement, plastics). Despite their diversity, they share a common set of binding constraints and a common strategic pattern: </w:t>
       </w:r>
       <w:r>
         <w:rPr>
@@ -20028,106 +19428,6 @@
       </w:r>
     </w:p>
     <w:p>
-      <w:pPr>
-        <w:pStyle w:val="Heading2"/>
-      </w:pPr>
-      <w:r>
-        <w:t>References</w:t>
-      </w:r>
-    </w:p>
-    <w:p>
-      <w:pPr>
-        <w:pStyle w:val="ListBullet"/>
-      </w:pPr>
-      <w:r>
-        <w:t>Electricity Regulatory Authority, tariffs 2025. https://www.era.go.ug/</w:t>
-      </w:r>
-    </w:p>
-    <w:p>
-      <w:pPr>
-        <w:pStyle w:val="ListBullet"/>
-      </w:pPr>
-      <w:r>
-        <w:t xml:space="preserve">KPMG, </w:t>
-      </w:r>
-      <w:r>
-        <w:rPr>
-          <w:i/>
-        </w:rPr>
-        <w:t>Uganda Budget Brief 2025/26</w:t>
-      </w:r>
-      <w:r>
-        <w:t>. https://assets.kpmg.com/</w:t>
-      </w:r>
-    </w:p>
-    <w:p>
-      <w:pPr>
-        <w:pStyle w:val="ListBullet"/>
-      </w:pPr>
-      <w:r>
-        <w:t>Uganda Manufacturers Association; UNIDO — skills evidence. https://uma.or.ug/ ; https://www.unido.org/</w:t>
-      </w:r>
-    </w:p>
-    <w:p>
-      <w:pPr>
-        <w:pStyle w:val="ListBullet"/>
-      </w:pPr>
-      <w:r>
-        <w:t xml:space="preserve">NEMA, </w:t>
-      </w:r>
-      <w:r>
-        <w:rPr>
-          <w:i/>
-        </w:rPr>
-        <w:t>Plastics Circularity Strategy 2023–2028</w:t>
-      </w:r>
-      <w:r>
-        <w:t xml:space="preserve">; </w:t>
-      </w:r>
-      <w:r>
-        <w:rPr>
-          <w:i/>
-        </w:rPr>
-        <w:t>Effluent Discharge Regulations 2020</w:t>
-      </w:r>
-      <w:r>
-        <w:t>. https://www.nema.go.ug/</w:t>
-      </w:r>
-    </w:p>
-    <w:p>
-      <w:pPr>
-        <w:pStyle w:val="ListBullet"/>
-      </w:pPr>
-      <w:r>
-        <w:t>National Drug Authority. https://www.nda.or.ug/</w:t>
-      </w:r>
-    </w:p>
-    <w:p>
-      <w:pPr>
-        <w:pStyle w:val="ListBullet"/>
-      </w:pPr>
-      <w:r>
-        <w:t xml:space="preserve">UNIDO, </w:t>
-      </w:r>
-      <w:r>
-        <w:rPr>
-          <w:i/>
-        </w:rPr>
-        <w:t>Programme for Country Partnership</w:t>
-      </w:r>
-      <w:r>
-        <w:t>. https://www.unido.org/programme-country-partnership</w:t>
-      </w:r>
-    </w:p>
-    <w:p>
-      <w:pPr>
-        <w:pStyle w:val="ListBullet"/>
-      </w:pPr>
-      <w:r>
-        <w:t>ITC TradeMap. https://www.trademap.org</w:t>
-      </w:r>
-    </w:p>
-    <w:p>
       <w:r>
         <w:br w:type="page"/>
       </w:r>
@@ -20204,7 +19504,7 @@
     </w:p>
     <w:p>
       <w:r>
-        <w:t xml:space="preserve">This chapter consolidates the prioritized products from Chapters 4–9 into an investment portfolio and phased roadmap for the six Report 2 chains. Project profiles cover the </w:t>
+        <w:t xml:space="preserve">This chapter consolidates the prioritized products from Chapters 4–9 into an investment portfolio and phased roadmap for the six value chains — Textiles &amp; Garments, Pharmaceuticals, Petrochemicals &amp; Fertilizers, Sugar &amp; Confectionery, Plastics &amp; Packaging, and Cement &amp; Building Materials. Project profiles cover the </w:t>
       </w:r>
       <w:r>
         <w:rPr>
@@ -21952,11 +21252,690 @@
       </w:r>
     </w:p>
     <w:p>
+      <w:r>
+        <w:br w:type="page"/>
+      </w:r>
+    </w:p>
+    <w:p>
       <w:pPr>
-        <w:pStyle w:val="Heading2"/>
+        <w:pStyle w:val="Heading1"/>
       </w:pPr>
       <w:r>
         <w:t>References</w:t>
+      </w:r>
+    </w:p>
+    <w:p>
+      <w:r>
+        <w:t>Consolidated sources for Report 2. Trade figures throughout are from ITC TradeMap (2024) and cited at the point of use; primary sector intelligence is from MTIC TWG engagements (see Chapter 3).</w:t>
+      </w:r>
+    </w:p>
+    <w:p>
+      <w:pPr>
+        <w:pStyle w:val="ListBullet"/>
+      </w:pPr>
+      <w:r>
+        <w:t xml:space="preserve">National Planning Authority, </w:t>
+      </w:r>
+      <w:r>
+        <w:rPr>
+          <w:i/>
+        </w:rPr>
+        <w:t>Uganda Vision 2040</w:t>
+      </w:r>
+      <w:r>
+        <w:t xml:space="preserve">; </w:t>
+      </w:r>
+      <w:r>
+        <w:rPr>
+          <w:i/>
+        </w:rPr>
+        <w:t>NDP IV (FY2025/26–2029/30)</w:t>
+      </w:r>
+      <w:r>
+        <w:t>. https://npa.go.ug/national-development-plan/</w:t>
+      </w:r>
+    </w:p>
+    <w:p>
+      <w:pPr>
+        <w:pStyle w:val="ListBullet"/>
+      </w:pPr>
+      <w:r>
+        <w:t>Parliament of Uganda, NDP IV launch. https://www.parliament.go.ug/news/3724/president-launches-ndp-iv-drive-ugandas-economic-transformation</w:t>
+      </w:r>
+    </w:p>
+    <w:p>
+      <w:pPr>
+        <w:pStyle w:val="ListBullet"/>
+      </w:pPr>
+      <w:r>
+        <w:t xml:space="preserve">MTIC, </w:t>
+      </w:r>
+      <w:r>
+        <w:rPr>
+          <w:i/>
+        </w:rPr>
+        <w:t>National Industrial Policy 2020</w:t>
+      </w:r>
+      <w:r>
+        <w:t>. https://www.mtic.go.ug/</w:t>
+      </w:r>
+    </w:p>
+    <w:p>
+      <w:pPr>
+        <w:pStyle w:val="ListBullet"/>
+      </w:pPr>
+      <w:r>
+        <w:t xml:space="preserve">UNIDO, </w:t>
+      </w:r>
+      <w:r>
+        <w:rPr>
+          <w:i/>
+        </w:rPr>
+        <w:t>Programme for Country Partnership</w:t>
+      </w:r>
+      <w:r>
+        <w:t>. https://www.unido.org/programme-country-partnership</w:t>
+      </w:r>
+    </w:p>
+    <w:p>
+      <w:pPr>
+        <w:pStyle w:val="ListBullet"/>
+      </w:pPr>
+      <w:r>
+        <w:t xml:space="preserve">World Bank, </w:t>
+      </w:r>
+      <w:r>
+        <w:rPr>
+          <w:i/>
+        </w:rPr>
+        <w:t>World Development Indicators</w:t>
+      </w:r>
+      <w:r>
+        <w:t>. https://data.worldbank.org/indicator/NV.IND.MANF.ZS?locations=UG</w:t>
+      </w:r>
+    </w:p>
+    <w:p>
+      <w:pPr>
+        <w:pStyle w:val="ListBullet"/>
+      </w:pPr>
+      <w:r>
+        <w:t>Cotton Development Organisation. https://www.cdouga.org/</w:t>
+      </w:r>
+    </w:p>
+    <w:p>
+      <w:pPr>
+        <w:pStyle w:val="ListBullet"/>
+      </w:pPr>
+      <w:r>
+        <w:t xml:space="preserve">UNIDO, </w:t>
+      </w:r>
+      <w:r>
+        <w:rPr>
+          <w:i/>
+        </w:rPr>
+        <w:t>Pharmaceutical Sector Profile — Uganda</w:t>
+      </w:r>
+      <w:r>
+        <w:t>. https://open.unido.org/</w:t>
+      </w:r>
+    </w:p>
+    <w:p>
+      <w:pPr>
+        <w:pStyle w:val="ListBullet"/>
+      </w:pPr>
+      <w:r>
+        <w:t>Uganda Investment Authority (2025). https://ugandainvest.go.ug/</w:t>
+      </w:r>
+    </w:p>
+    <w:p>
+      <w:pPr>
+        <w:pStyle w:val="ListBullet"/>
+      </w:pPr>
+      <w:r>
+        <w:t>ITC TradeMap. https://www.trademap.org</w:t>
+      </w:r>
+    </w:p>
+    <w:p>
+      <w:pPr>
+        <w:pStyle w:val="ListBullet"/>
+      </w:pPr>
+      <w:r>
+        <w:t xml:space="preserve">National Planning Authority, </w:t>
+      </w:r>
+      <w:r>
+        <w:rPr>
+          <w:i/>
+        </w:rPr>
+        <w:t>Vision 2040</w:t>
+      </w:r>
+      <w:r>
+        <w:t xml:space="preserve">; </w:t>
+      </w:r>
+      <w:r>
+        <w:rPr>
+          <w:i/>
+        </w:rPr>
+        <w:t>NDP IV</w:t>
+      </w:r>
+      <w:r>
+        <w:t>. https://npa.go.ug/national-development-plan/</w:t>
+      </w:r>
+    </w:p>
+    <w:p>
+      <w:pPr>
+        <w:pStyle w:val="ListBullet"/>
+      </w:pPr>
+      <w:r>
+        <w:t xml:space="preserve">National Drug Authority, </w:t>
+      </w:r>
+      <w:r>
+        <w:rPr>
+          <w:i/>
+        </w:rPr>
+        <w:t>National Drug Register</w:t>
+      </w:r>
+      <w:r>
+        <w:t xml:space="preserve"> (June 2024). https://www.nda.or.ug/</w:t>
+      </w:r>
+    </w:p>
+    <w:p>
+      <w:pPr>
+        <w:pStyle w:val="ListBullet"/>
+      </w:pPr>
+      <w:r>
+        <w:t xml:space="preserve">NEMA, </w:t>
+      </w:r>
+      <w:r>
+        <w:rPr>
+          <w:i/>
+        </w:rPr>
+        <w:t>National Strategy for Plastics Circularity 2023–2028</w:t>
+      </w:r>
+      <w:r>
+        <w:t xml:space="preserve">; </w:t>
+      </w:r>
+      <w:r>
+        <w:rPr>
+          <w:i/>
+        </w:rPr>
+        <w:t>Effluent Discharge Regulations 2020</w:t>
+      </w:r>
+      <w:r>
+        <w:t>. https://www.nema.go.ug/</w:t>
+      </w:r>
+    </w:p>
+    <w:p>
+      <w:pPr>
+        <w:pStyle w:val="ListBullet"/>
+      </w:pPr>
+      <w:r>
+        <w:t>Electricity Regulatory Authority, tariffs 2025. https://www.era.go.ug/</w:t>
+      </w:r>
+    </w:p>
+    <w:p>
+      <w:pPr>
+        <w:pStyle w:val="ListBullet"/>
+      </w:pPr>
+      <w:r>
+        <w:t xml:space="preserve">World Bank, </w:t>
+      </w:r>
+      <w:r>
+        <w:rPr>
+          <w:i/>
+        </w:rPr>
+        <w:t>World Development Indicators</w:t>
+      </w:r>
+      <w:r>
+        <w:t>. https://data.worldbank.org/country/UG</w:t>
+      </w:r>
+    </w:p>
+    <w:p>
+      <w:pPr>
+        <w:pStyle w:val="ListBullet"/>
+      </w:pPr>
+      <w:r>
+        <w:t>Cotton Development Organisation. https://www.cdouga.org/ ; World Business Journal, "CDO Leads Way for Increased Cotton Subsector Growth." https://worldbusinessjournal.com/cdo-leads-way/</w:t>
+      </w:r>
+    </w:p>
+    <w:p>
+      <w:pPr>
+        <w:pStyle w:val="ListBullet"/>
+      </w:pPr>
+      <w:r>
+        <w:t xml:space="preserve">Economic Policy Research Centre, </w:t>
+      </w:r>
+      <w:r>
+        <w:rPr>
+          <w:i/>
+        </w:rPr>
+        <w:t>Upgrading the cotton value chain for textile industry development</w:t>
+      </w:r>
+      <w:r>
+        <w:t>. https://eprcug.org/publication/upgrading-the-cotton-value-chain-for-textile-industry-development/</w:t>
+      </w:r>
+    </w:p>
+    <w:p>
+      <w:pPr>
+        <w:pStyle w:val="ListBullet"/>
+      </w:pPr>
+      <w:r>
+        <w:t>ChimpReports, "Inside Fine Spinners: spinning Uganda's cotton to European garment stores." https://chimpreports.com/inside-fine-spinners-spinning-ugandas-cotton-to-european-garment-stores/</w:t>
+      </w:r>
+    </w:p>
+    <w:p>
+      <w:pPr>
+        <w:pStyle w:val="ListBullet"/>
+      </w:pPr>
+      <w:r>
+        <w:t>Uganda Investment Authority, "UIA, CDO team up to boost import substitution in cotton sector." https://www.ugandainvest.go.ug/uia-cdo-team-up-to-boost-import-substitution-in-cotton-sector/</w:t>
+      </w:r>
+    </w:p>
+    <w:p>
+      <w:pPr>
+        <w:pStyle w:val="ListBullet"/>
+      </w:pPr>
+      <w:r>
+        <w:t>ITC TradeMap, trade statistics — HS 5201, 6109, Uganda, 2024. https://www.trademap.org</w:t>
+      </w:r>
+    </w:p>
+    <w:p>
+      <w:pPr>
+        <w:pStyle w:val="ListBullet"/>
+      </w:pPr>
+      <w:r>
+        <w:t xml:space="preserve">NEMA, </w:t>
+      </w:r>
+      <w:r>
+        <w:rPr>
+          <w:i/>
+        </w:rPr>
+        <w:t>Effluent Discharge Regulations 2020</w:t>
+      </w:r>
+      <w:r>
+        <w:t>. https://www.nema.go.ug/</w:t>
+      </w:r>
+    </w:p>
+    <w:p>
+      <w:pPr>
+        <w:pStyle w:val="ListBullet"/>
+      </w:pPr>
+      <w:r>
+        <w:t xml:space="preserve">National Drug Authority, </w:t>
+      </w:r>
+      <w:r>
+        <w:rPr>
+          <w:i/>
+        </w:rPr>
+        <w:t>National Drug Register of Uganda — Human Medicines</w:t>
+      </w:r>
+      <w:r>
+        <w:t xml:space="preserve"> (June 2024). https://www.nda.or.ug/</w:t>
+      </w:r>
+    </w:p>
+    <w:p>
+      <w:pPr>
+        <w:pStyle w:val="ListBullet"/>
+      </w:pPr>
+      <w:r>
+        <w:t xml:space="preserve">UNIDO, </w:t>
+      </w:r>
+      <w:r>
+        <w:rPr>
+          <w:i/>
+        </w:rPr>
+        <w:t>Pharmaceutical Sector Profile — Uganda</w:t>
+      </w:r>
+      <w:r>
+        <w:t>. https://open.unido.org/api/documents/4699932/download/Pharmaceutical%20Sector%20Profile%20-%20Uganda</w:t>
+      </w:r>
+    </w:p>
+    <w:p>
+      <w:pPr>
+        <w:pStyle w:val="ListBullet"/>
+      </w:pPr>
+      <w:r>
+        <w:t xml:space="preserve">Statista, </w:t>
+      </w:r>
+      <w:r>
+        <w:rPr>
+          <w:i/>
+        </w:rPr>
+        <w:t>Pharmaceuticals — Uganda</w:t>
+      </w:r>
+      <w:r>
+        <w:t>. https://www.statista.com/outlook/hmo/pharmaceuticals/uganda</w:t>
+      </w:r>
+    </w:p>
+    <w:p>
+      <w:pPr>
+        <w:pStyle w:val="ListBullet"/>
+      </w:pPr>
+      <w:r>
+        <w:t>Quality Chemical Industries Limited (Wikipedia summary); Cipla Uganda. https://en.wikipedia.org/wiki/Quality_Chemical_Industries_Limited ; https://www.cipla.com/our-presence/uganda</w:t>
+      </w:r>
+    </w:p>
+    <w:p>
+      <w:pPr>
+        <w:pStyle w:val="ListBullet"/>
+      </w:pPr>
+      <w:r>
+        <w:t>ITC TradeMap, trade statistics — HS 3004, Uganda, 2024. https://www.trademap.org</w:t>
+      </w:r>
+    </w:p>
+    <w:p>
+      <w:pPr>
+        <w:pStyle w:val="ListBullet"/>
+      </w:pPr>
+      <w:r>
+        <w:t>Uganda National Oil Company, "The Uganda Refinery Project." https://www.unoc.co.ug/midstream/the-uganda-refinery-project/</w:t>
+      </w:r>
+    </w:p>
+    <w:p>
+      <w:pPr>
+        <w:pStyle w:val="ListBullet"/>
+      </w:pPr>
+      <w:r>
+        <w:t>Petroleum Authority of Uganda, "The Uganda Refinery Project." https://www.pau.go.ug/the-uganda-refinery-project/</w:t>
+      </w:r>
+    </w:p>
+    <w:p>
+      <w:pPr>
+        <w:pStyle w:val="ListBullet"/>
+      </w:pPr>
+      <w:r>
+        <w:t>Hydrocarbon Engineering, "Uganda refinery to start operations by early 2030" (Oct 2025). https://www.hydrocarbonengineering.com/refining/13102025/uganda-refinery-to-start-operations-by-early-2030/</w:t>
+      </w:r>
+    </w:p>
+    <w:p>
+      <w:pPr>
+        <w:pStyle w:val="ListBullet"/>
+      </w:pPr>
+      <w:r>
+        <w:t>Osukuru Industrial Complex (Wikipedia). https://en.wikipedia.org/wiki/Osukuru_Industrial_Complex</w:t>
+      </w:r>
+    </w:p>
+    <w:p>
+      <w:pPr>
+        <w:pStyle w:val="ListBullet"/>
+      </w:pPr>
+      <w:r>
+        <w:t>Free Zones Authority, "President commissions Tororo Sukulu Phosphate Project." https://freezones.go.ug/president-commissions-tororo-sukulu-phosphate-project/</w:t>
+      </w:r>
+    </w:p>
+    <w:p>
+      <w:pPr>
+        <w:pStyle w:val="ListBullet"/>
+      </w:pPr>
+      <w:r>
+        <w:t>Milling Middle East &amp; Africa, "Tororo Fertiliser Factory in limbo five months after resuming operations" (2023). https://www.millingmea.com/tororo-fertiliser-factory-in-limbo-five-months-after-resuming-operations/</w:t>
+      </w:r>
+    </w:p>
+    <w:p>
+      <w:pPr>
+        <w:pStyle w:val="ListBullet"/>
+      </w:pPr>
+      <w:r>
+        <w:t>ITC TradeMap, trade statistics — HS 3105, Uganda, 2024. https://www.trademap.org</w:t>
+      </w:r>
+    </w:p>
+    <w:p>
+      <w:pPr>
+        <w:pStyle w:val="ListBullet"/>
+      </w:pPr>
+      <w:r>
+        <w:rPr>
+          <w:i/>
+        </w:rPr>
+        <w:t>Sugar industry in Uganda</w:t>
+      </w:r>
+      <w:r>
+        <w:t xml:space="preserve"> (Wikipedia, with USMA and Uganda Sugar Board data). https://en.wikipedia.org/wiki/Sugar_industry_in_Uganda</w:t>
+      </w:r>
+    </w:p>
+    <w:p>
+      <w:pPr>
+        <w:pStyle w:val="ListBullet"/>
+      </w:pPr>
+      <w:r>
+        <w:t>Daily Monitor, "Surge in sugar factories imperils industry's future." https://www.monitor.co.ug/uganda/news/national/surge-in-sugar-factories-imperils-industry-s-future-3943728</w:t>
+      </w:r>
+    </w:p>
+    <w:p>
+      <w:pPr>
+        <w:pStyle w:val="ListBullet"/>
+      </w:pPr>
+      <w:r>
+        <w:t>Food Business MEA, "Kinyara Sugar opens US$15m industrial sugar refinery" (2023). https://www.foodbusinessmea.com/ugandas-second-largest-sugar-miller-kinyara-sugar-has-opened-us15m-industrial-sugar-refinery/</w:t>
+      </w:r>
+    </w:p>
+    <w:p>
+      <w:pPr>
+        <w:pStyle w:val="ListBullet"/>
+      </w:pPr>
+      <w:r>
+        <w:t>Kakira Sugar. https://kakirasugar.com/</w:t>
+      </w:r>
+    </w:p>
+    <w:p>
+      <w:pPr>
+        <w:pStyle w:val="ListBullet"/>
+      </w:pPr>
+      <w:r>
+        <w:t xml:space="preserve">Uganda Sugar Manufacturers' Association annual report 2024 [Repository: </w:t>
+      </w:r>
+      <w:r>
+        <w:rPr>
+          <w:rFonts w:ascii="Consolas" w:hAnsi="Consolas"/>
+          <w:sz w:val="19"/>
+        </w:rPr>
+        <w:t>data/</w:t>
+      </w:r>
+      <w:r>
+        <w:t xml:space="preserve"> — provided by MTIC].</w:t>
+      </w:r>
+    </w:p>
+    <w:p>
+      <w:pPr>
+        <w:pStyle w:val="ListBullet"/>
+      </w:pPr>
+      <w:r>
+        <w:t>ITC TradeMap, trade statistics — HS 1701, Uganda, 2024. https://www.trademap.org</w:t>
+      </w:r>
+    </w:p>
+    <w:p>
+      <w:pPr>
+        <w:pStyle w:val="ListBullet"/>
+      </w:pPr>
+      <w:r>
+        <w:t xml:space="preserve">NEMA, </w:t>
+      </w:r>
+      <w:r>
+        <w:rPr>
+          <w:i/>
+        </w:rPr>
+        <w:t>National Strategy for Management of Plastic Pollution / Plastics Circularity (2023–2028)</w:t>
+      </w:r>
+      <w:r>
+        <w:t>. https://www.nema.go.ug/new_site/wp-content/uploads/2024/05/Plastic_circularity_-Report-2023-1.pdf</w:t>
+      </w:r>
+    </w:p>
+    <w:p>
+      <w:pPr>
+        <w:pStyle w:val="ListBullet"/>
+      </w:pPr>
+      <w:r>
+        <w:t>NEMA, "Plastics." https://www.nema.go.ug/en/plastics/</w:t>
+      </w:r>
+    </w:p>
+    <w:p>
+      <w:pPr>
+        <w:pStyle w:val="ListBullet"/>
+      </w:pPr>
+      <w:r>
+        <w:t>Margherita News, "NEMA pushes for total ban of polythene bags in Uganda" (Mar 2025). https://margheritanews.ug/2025/03/nema-pushes-for-total-polythene-bags-of-kevera-in-uganda/</w:t>
+      </w:r>
+    </w:p>
+    <w:p>
+      <w:pPr>
+        <w:pStyle w:val="ListBullet"/>
+      </w:pPr>
+      <w:r>
+        <w:t xml:space="preserve">Reportlinker, </w:t>
+      </w:r>
+      <w:r>
+        <w:rPr>
+          <w:i/>
+        </w:rPr>
+        <w:t>Uganda Plastic Industry Outlook 2024–2028</w:t>
+      </w:r>
+      <w:r>
+        <w:t>. https://www.reportlinker.com/clp/country/6347/726256</w:t>
+      </w:r>
+    </w:p>
+    <w:p>
+      <w:pPr>
+        <w:pStyle w:val="ListBullet"/>
+      </w:pPr>
+      <w:r>
+        <w:t>Nile Plastic Industries. https://www.nileplasticindustries.com/</w:t>
+      </w:r>
+    </w:p>
+    <w:p>
+      <w:pPr>
+        <w:pStyle w:val="ListBullet"/>
+      </w:pPr>
+      <w:r>
+        <w:t>ITC TradeMap, trade statistics — HS 3923, Uganda, 2024. https://www.trademap.org</w:t>
+      </w:r>
+    </w:p>
+    <w:p>
+      <w:pPr>
+        <w:pStyle w:val="ListBullet"/>
+      </w:pPr>
+      <w:r>
+        <w:t xml:space="preserve">IndexBox, </w:t>
+      </w:r>
+      <w:r>
+        <w:rPr>
+          <w:i/>
+        </w:rPr>
+        <w:t>Uganda's Cement Market Report 2025</w:t>
+      </w:r>
+      <w:r>
+        <w:t>. https://www.indexbox.io/store/uganda-cement-market-analysis-forecast-size-trends-and-insights/</w:t>
+      </w:r>
+    </w:p>
+    <w:p>
+      <w:pPr>
+        <w:pStyle w:val="ListBullet"/>
+      </w:pPr>
+      <w:r>
+        <w:t>CemNet / International Cement Review, Uganda country data. https://www.cemnet.com/global-cement-report/country/uganda</w:t>
+      </w:r>
+    </w:p>
+    <w:p>
+      <w:pPr>
+        <w:pStyle w:val="ListBullet"/>
+      </w:pPr>
+      <w:r>
+        <w:t>Ecofin Agency, "Uganda to Commission $300 Million Cement Plant to Cut Imports Amid Rising Demand." https://www.ecofinagency.com/news-industry/2104-54866-uganda-to-commission-300-million-cement-plant-to-cut-imports-amid-rising-demand</w:t>
+      </w:r>
+    </w:p>
+    <w:p>
+      <w:pPr>
+        <w:pStyle w:val="ListBullet"/>
+      </w:pPr>
+      <w:r>
+        <w:t>CemNet, "Uganda launching US$300m cement plant to boost industry." https://www.cemnet.com/News/story/181356/uganda-launching-us-300m-cement-plant-to-boost-industry.html</w:t>
+      </w:r>
+    </w:p>
+    <w:p>
+      <w:pPr>
+        <w:pStyle w:val="ListBullet"/>
+      </w:pPr>
+      <w:r>
+        <w:rPr>
+          <w:i/>
+        </w:rPr>
+        <w:t>List of cement manufacturers in Uganda</w:t>
+      </w:r>
+      <w:r>
+        <w:t xml:space="preserve"> (Wikipedia). https://en.wikipedia.org/wiki/List_of_cement_manufacturers_in_Uganda</w:t>
+      </w:r>
+    </w:p>
+    <w:p>
+      <w:pPr>
+        <w:pStyle w:val="ListBullet"/>
+      </w:pPr>
+      <w:r>
+        <w:t>Hima Cement, "About Us." https://himacement.co/About-Us</w:t>
+      </w:r>
+    </w:p>
+    <w:p>
+      <w:pPr>
+        <w:pStyle w:val="ListBullet"/>
+      </w:pPr>
+      <w:r>
+        <w:t>ITC TradeMap, trade statistics — HS 2523, Uganda, 2024. https://www.trademap.org</w:t>
+      </w:r>
+    </w:p>
+    <w:p>
+      <w:pPr>
+        <w:pStyle w:val="ListBullet"/>
+      </w:pPr>
+      <w:r>
+        <w:t xml:space="preserve">KPMG, </w:t>
+      </w:r>
+      <w:r>
+        <w:rPr>
+          <w:i/>
+        </w:rPr>
+        <w:t>Uganda Budget Brief 2025/26</w:t>
+      </w:r>
+      <w:r>
+        <w:t>. https://assets.kpmg.com/</w:t>
+      </w:r>
+    </w:p>
+    <w:p>
+      <w:pPr>
+        <w:pStyle w:val="ListBullet"/>
+      </w:pPr>
+      <w:r>
+        <w:t>Uganda Manufacturers Association; UNIDO — skills evidence. https://uma.or.ug/ ; https://www.unido.org/</w:t>
+      </w:r>
+    </w:p>
+    <w:p>
+      <w:pPr>
+        <w:pStyle w:val="ListBullet"/>
+      </w:pPr>
+      <w:r>
+        <w:t xml:space="preserve">NEMA, </w:t>
+      </w:r>
+      <w:r>
+        <w:rPr>
+          <w:i/>
+        </w:rPr>
+        <w:t>Plastics Circularity Strategy 2023–2028</w:t>
+      </w:r>
+      <w:r>
+        <w:t xml:space="preserve">; </w:t>
+      </w:r>
+      <w:r>
+        <w:rPr>
+          <w:i/>
+        </w:rPr>
+        <w:t>Effluent Discharge Regulations 2020</w:t>
+      </w:r>
+      <w:r>
+        <w:t>. https://www.nema.go.ug/</w:t>
+      </w:r>
+    </w:p>
+    <w:p>
+      <w:pPr>
+        <w:pStyle w:val="ListBullet"/>
+      </w:pPr>
+      <w:r>
+        <w:t>National Drug Authority. https://www.nda.or.ug/</w:t>
       </w:r>
     </w:p>
     <w:p>

</xml_diff>